<commit_message>
docs: ghi kết quả test case Sprint 2, cập nhật trạng thái chức năng và README
- Test case Sprint 2: 16 ca Đạt, TC-073 và TC-074 không áp dụng; sửa tiêu đề 17 thành 18 ca
- Danh sách chức năng: 15 chức năng Sprint 2 Hoàn thành (32/49)
- User Story: 16 story Sprint 2 Hoàn thành (33/51)
- README: Sprint 2 hoàn thành, mô tả dữ liệu mẫu

Co-Authored-By: Claude Sonnet 5.5 <noreply@anthropic.com>
Claude-Session: https://claude.ai/code/session_01KmcifPk7biQekxyaV5upbh
</commit_message>
<xml_diff>
--- a/QuickOrder_TestCases_Sprint2.docx
+++ b/QuickOrder_TestCases_Sprint2.docx
@@ -27,7 +27,7 @@
           <w:color w:val="718096"/>
           <w:sz w:val="22"/>
         </w:rPr>
-        <w:t>Dự án QuickOrder • Đặt hàng &amp; Xử lý đơn (17 Test Cases)</w:t>
+        <w:t>Dự án QuickOrder • Đặt hàng &amp; Xử lý đơn (18 Test Cases)</w:t>
       </w:r>
     </w:p>
     <w:p>
@@ -324,10 +324,11 @@
             <w:r>
               <w:rPr>
                 <w:rFonts w:ascii="Arial" w:hAnsi="Arial"/>
-                <w:color w:val="2D3748"/>
+                <w:b/>
+                <w:color w:val="2F855A"/>
                 <w:sz w:val="18"/>
               </w:rPr>
-              <w:t>Chưa chạy</w:t>
+              <w:t>Đạt</w:t>
             </w:r>
           </w:p>
         </w:tc>
@@ -455,10 +456,11 @@
             <w:r>
               <w:rPr>
                 <w:rFonts w:ascii="Arial" w:hAnsi="Arial"/>
-                <w:color w:val="2D3748"/>
+                <w:b/>
+                <w:color w:val="2F855A"/>
                 <w:sz w:val="18"/>
               </w:rPr>
-              <w:t>Chưa chạy</w:t>
+              <w:t>Đạt</w:t>
             </w:r>
           </w:p>
         </w:tc>
@@ -586,10 +588,11 @@
             <w:r>
               <w:rPr>
                 <w:rFonts w:ascii="Arial" w:hAnsi="Arial"/>
-                <w:color w:val="2D3748"/>
+                <w:b/>
+                <w:color w:val="2F855A"/>
                 <w:sz w:val="18"/>
               </w:rPr>
-              <w:t>Chưa chạy</w:t>
+              <w:t>Đạt</w:t>
             </w:r>
           </w:p>
         </w:tc>
@@ -894,10 +897,11 @@
             <w:r>
               <w:rPr>
                 <w:rFonts w:ascii="Arial" w:hAnsi="Arial"/>
-                <w:color w:val="2D3748"/>
+                <w:b/>
+                <w:color w:val="718096"/>
                 <w:sz w:val="18"/>
               </w:rPr>
-              <w:t>Chưa chạy</w:t>
+              <w:t>Không áp dụng</w:t>
             </w:r>
           </w:p>
         </w:tc>
@@ -1025,10 +1029,11 @@
             <w:r>
               <w:rPr>
                 <w:rFonts w:ascii="Arial" w:hAnsi="Arial"/>
-                <w:color w:val="2D3748"/>
+                <w:b/>
+                <w:color w:val="718096"/>
                 <w:sz w:val="18"/>
               </w:rPr>
-              <w:t>Chưa chạy</w:t>
+              <w:t>Không áp dụng</w:t>
             </w:r>
           </w:p>
         </w:tc>
@@ -1156,10 +1161,11 @@
             <w:r>
               <w:rPr>
                 <w:rFonts w:ascii="Arial" w:hAnsi="Arial"/>
-                <w:color w:val="2D3748"/>
+                <w:b/>
+                <w:color w:val="2F855A"/>
                 <w:sz w:val="18"/>
               </w:rPr>
-              <w:t>Chưa chạy</w:t>
+              <w:t>Đạt</w:t>
             </w:r>
           </w:p>
         </w:tc>
@@ -1287,10 +1293,11 @@
             <w:r>
               <w:rPr>
                 <w:rFonts w:ascii="Arial" w:hAnsi="Arial"/>
-                <w:color w:val="2D3748"/>
+                <w:b/>
+                <w:color w:val="2F855A"/>
                 <w:sz w:val="18"/>
               </w:rPr>
-              <w:t>Chưa chạy</w:t>
+              <w:t>Đạt</w:t>
             </w:r>
           </w:p>
         </w:tc>
@@ -1418,10 +1425,11 @@
             <w:r>
               <w:rPr>
                 <w:rFonts w:ascii="Arial" w:hAnsi="Arial"/>
-                <w:color w:val="2D3748"/>
+                <w:b/>
+                <w:color w:val="2F855A"/>
                 <w:sz w:val="18"/>
               </w:rPr>
-              <w:t>Chưa chạy</w:t>
+              <w:t>Đạt</w:t>
             </w:r>
           </w:p>
         </w:tc>
@@ -1549,10 +1557,11 @@
             <w:r>
               <w:rPr>
                 <w:rFonts w:ascii="Arial" w:hAnsi="Arial"/>
-                <w:color w:val="2D3748"/>
+                <w:b/>
+                <w:color w:val="2F855A"/>
                 <w:sz w:val="18"/>
               </w:rPr>
-              <w:t>Chưa chạy</w:t>
+              <w:t>Đạt</w:t>
             </w:r>
           </w:p>
         </w:tc>
@@ -1680,10 +1689,11 @@
             <w:r>
               <w:rPr>
                 <w:rFonts w:ascii="Arial" w:hAnsi="Arial"/>
-                <w:color w:val="2D3748"/>
+                <w:b/>
+                <w:color w:val="2F855A"/>
                 <w:sz w:val="18"/>
               </w:rPr>
-              <w:t>Chưa chạy</w:t>
+              <w:t>Đạt</w:t>
             </w:r>
           </w:p>
         </w:tc>
@@ -1811,10 +1821,11 @@
             <w:r>
               <w:rPr>
                 <w:rFonts w:ascii="Arial" w:hAnsi="Arial"/>
-                <w:color w:val="2D3748"/>
+                <w:b/>
+                <w:color w:val="2F855A"/>
                 <w:sz w:val="18"/>
               </w:rPr>
-              <w:t>Chưa chạy</w:t>
+              <w:t>Đạt</w:t>
             </w:r>
           </w:p>
         </w:tc>
@@ -1942,10 +1953,11 @@
             <w:r>
               <w:rPr>
                 <w:rFonts w:ascii="Arial" w:hAnsi="Arial"/>
-                <w:color w:val="2D3748"/>
+                <w:b/>
+                <w:color w:val="2F855A"/>
                 <w:sz w:val="18"/>
               </w:rPr>
-              <w:t>Chưa chạy</w:t>
+              <w:t>Đạt</w:t>
             </w:r>
           </w:p>
         </w:tc>
@@ -2073,10 +2085,11 @@
             <w:r>
               <w:rPr>
                 <w:rFonts w:ascii="Arial" w:hAnsi="Arial"/>
-                <w:color w:val="2D3748"/>
+                <w:b/>
+                <w:color w:val="2F855A"/>
                 <w:sz w:val="18"/>
               </w:rPr>
-              <w:t>Chưa chạy</w:t>
+              <w:t>Đạt</w:t>
             </w:r>
           </w:p>
         </w:tc>
@@ -2204,10 +2217,11 @@
             <w:r>
               <w:rPr>
                 <w:rFonts w:ascii="Arial" w:hAnsi="Arial"/>
-                <w:color w:val="2D3748"/>
+                <w:b/>
+                <w:color w:val="2F855A"/>
                 <w:sz w:val="18"/>
               </w:rPr>
-              <w:t>Chưa chạy</w:t>
+              <w:t>Đạt</w:t>
             </w:r>
           </w:p>
         </w:tc>
@@ -2512,10 +2526,11 @@
             <w:r>
               <w:rPr>
                 <w:rFonts w:ascii="Arial" w:hAnsi="Arial"/>
-                <w:color w:val="2D3748"/>
+                <w:b/>
+                <w:color w:val="2F855A"/>
                 <w:sz w:val="18"/>
               </w:rPr>
-              <w:t>Chưa chạy</w:t>
+              <w:t>Đạt</w:t>
             </w:r>
           </w:p>
         </w:tc>
@@ -2643,10 +2658,11 @@
             <w:r>
               <w:rPr>
                 <w:rFonts w:ascii="Arial" w:hAnsi="Arial"/>
-                <w:color w:val="2D3748"/>
+                <w:b/>
+                <w:color w:val="2F855A"/>
                 <w:sz w:val="18"/>
               </w:rPr>
-              <w:t>Chưa chạy</w:t>
+              <w:t>Đạt</w:t>
             </w:r>
           </w:p>
         </w:tc>
@@ -2774,10 +2790,11 @@
             <w:r>
               <w:rPr>
                 <w:rFonts w:ascii="Arial" w:hAnsi="Arial"/>
-                <w:color w:val="2D3748"/>
+                <w:b/>
+                <w:color w:val="2F855A"/>
                 <w:sz w:val="18"/>
               </w:rPr>
-              <w:t>Chưa chạy</w:t>
+              <w:t>Đạt</w:t>
             </w:r>
           </w:p>
         </w:tc>
@@ -2905,10 +2922,11 @@
             <w:r>
               <w:rPr>
                 <w:rFonts w:ascii="Arial" w:hAnsi="Arial"/>
-                <w:color w:val="2D3748"/>
+                <w:b/>
+                <w:color w:val="2F855A"/>
                 <w:sz w:val="18"/>
               </w:rPr>
-              <w:t>Chưa chạy</w:t>
+              <w:t>Đạt</w:t>
             </w:r>
           </w:p>
         </w:tc>
@@ -2918,6 +2936,21 @@
       <w:pPr>
         <w:spacing w:after="120"/>
       </w:pPr>
+    </w:p>
+    <w:p>
+      <w:r>
+        <w:rPr>
+          <w:b/>
+          <w:sz w:val="18"/>
+        </w:rPr>
+        <w:t xml:space="preserve">Ghi chú kết quả (28/10/2026): </w:t>
+      </w:r>
+      <w:r>
+        <w:rPr>
+          <w:sz w:val="18"/>
+        </w:rPr>
+        <w:t>16 ca Đạt, chạy bằng kịch bản tự động trên trình duyệt Chromium với dữ liệu mẫu từ seed_data.py. TC-073 và TC-074 không áp dụng: hệ thống không có trang tìm quán, khách chỉ gọi món qua mã QR của bàn (quyết định số 1 và 2 trong mục "Cần chốt" của danh sách chức năng). TC-013: chủ quán phải đăng nhập; nếu chưa đăng nhập, trang chuyển về trang đăng nhập.</w:t>
+      </w:r>
     </w:p>
     <w:sectPr>
       <w:pgSz w:w="12240" w:h="15840"/>

</xml_diff>